<commit_message>
Clarify project leadership and server contributions; reorder ocean improvements
</commit_message>
<xml_diff>
--- a/James_Zhang_Resume_English.docx
+++ b/James_Zhang_Resume_English.docx
@@ -2007,7 +2007,7 @@
                                   <w:color w:val="414141"/>
                                   <w:szCs w:val="21"/>
                                 </w:rPr>
-                                <w:t xml:space="preserve">ByteDance  |  Level 3-2</w:t>
+                                <w:t xml:space="preserve">ByteDance  |  Lead Programmer  |  Level 3-2</w:t>
                               </w:r>
                               <w:proofErr w:type="gramEnd"/>
                             </w:p>
@@ -2182,7 +2182,7 @@
                             <w:color w:val="414141"/>
                             <w:szCs w:val="21"/>
                           </w:rPr>
-                          <w:t xml:space="preserve">ByteDance  |  Level 3-2</w:t>
+                          <w:t xml:space="preserve">ByteDance  |  Lead Programmer  |  Level 3-2</w:t>
                         </w:r>
                         <w:proofErr w:type="gramEnd"/>
                       </w:p>
@@ -2563,7 +2563,7 @@
                                   <w:iCs/>
                                   <w:sz w:val="20"/>
                                 </w:rPr>
-                                <w:t xml:space="preserve">Ouroboros Incubation Project (2025-2026) | UE5 | Engine Team Lead</w:t>
+                                <w:t xml:space="preserve">Ouroboros Incubation Project (2025-2026) | UE5 | Lead Programmer</w:t>
                               </w:r>
                               <w:proofErr w:type="gramStart"/>
                               <w:proofErr w:type="gramEnd"/>
@@ -3138,7 +3138,7 @@
                             <w:iCs/>
                             <w:sz w:val="20"/>
                           </w:rPr>
-                          <w:t xml:space="preserve">Ouroboros Incubation Project (2025-2026) | UE5 | Engine Team Lead</w:t>
+                          <w:t xml:space="preserve">Ouroboros Incubation Project (2025-2026) | UE5 | Lead Programmer</w:t>
                         </w:r>
                         <w:proofErr w:type="gramStart"/>
                         <w:proofErr w:type="gramEnd"/>
@@ -4853,7 +4853,7 @@
                                   <w:iCs/>
                                   <w:sz w:val="19"/>
                                 </w:rPr>
-                                <w:t xml:space="preserve">Datang Wushuang (2010-2017) | NetEase Proprietary Engine | Engine Programmer</w:t>
+                                <w:t xml:space="preserve">Datang Wushuang (2010-2017) | NetEase Proprietary Engine | Server Engine Lead</w:t>
                               </w:r>
                               <w:proofErr w:type="gramStart"/>
                               <w:proofErr w:type="gramEnd"/>
@@ -4995,7 +4995,7 @@
                                   <w:sz w:val="17"/>
                                   <w:szCs w:val="17"/>
                                 </w:rPr>
-                                <w:t xml:space="preserve">Refactored networking for simpler, extensible message dispatch</w:t>
+                                <w:t xml:space="preserve">Developed the server network layer and character synchronization</w:t>
                               </w:r>
                             </w:p>
                             <w:p>
@@ -5111,7 +5111,7 @@
                                   <w:sz w:val="17"/>
                                   <w:szCs w:val="17"/>
                                 </w:rPr>
-                                <w:t xml:space="preserve">The Datang Wushuang cross-server framework remains in use today</w:t>
+                                <w:t xml:space="preserve">Developed a mini-client system enabling play while game assets download</w:t>
                               </w:r>
                             </w:p>
                             <w:p>
@@ -5812,7 +5812,7 @@
                             <w:iCs/>
                             <w:sz w:val="19"/>
                           </w:rPr>
-                          <w:t xml:space="preserve">Datang Wushuang (2010-2017) | NetEase Proprietary Engine | Engine Programmer</w:t>
+                          <w:t xml:space="preserve">Datang Wushuang (2010-2017) | NetEase Proprietary Engine | Server Engine Lead</w:t>
                         </w:r>
                         <w:proofErr w:type="gramStart"/>
                         <w:proofErr w:type="gramEnd"/>
@@ -5954,7 +5954,7 @@
                             <w:sz w:val="17"/>
                             <w:szCs w:val="17"/>
                           </w:rPr>
-                          <w:t xml:space="preserve">Refactored networking for simpler, extensible message dispatch</w:t>
+                          <w:t xml:space="preserve">Developed the server network layer and character synchronization</w:t>
                         </w:r>
                       </w:p>
                       <w:p>
@@ -6070,7 +6070,7 @@
                             <w:sz w:val="17"/>
                             <w:szCs w:val="17"/>
                           </w:rPr>
-                          <w:t xml:space="preserve">The Datang Wushuang cross-server framework remains in use today</w:t>
+                          <w:t xml:space="preserve">Developed a mini-client system enabling play while game assets download</w:t>
                         </w:r>
                       </w:p>
                       <w:p>

</xml_diff>

<commit_message>
Add bachelor education and language proficiency to portfolio and resume
</commit_message>
<xml_diff>
--- a/James_Zhang_Resume_English.docx
+++ b/James_Zhang_Resume_English.docx
@@ -1483,6 +1483,26 @@
                                 <w:t xml:space="preserve">Jul 2007 - Jun 2010          School of Computer Science, SCUT  (Master's)</w:t>
                               </w:r>
                             </w:p>
+                            <w:p>
+                              <w:pPr>
+                                <w:adjustRightInd w:val="0"/>
+                                <w:snapToGrid w:val="0"/>
+                                <w:rPr>
+                                  <w:rFonts w:ascii="微软雅黑" w:hAnsi="微软雅黑" w:hint="eastAsia"/>
+                                  <w:color w:val="414141"/>
+                                  <w:szCs w:val="21"/>
+                                </w:rPr>
+                                <w:spacing w:before="70" w:after="0" w:line="240" w:lineRule="auto"/>
+                              </w:pPr>
+                              <w:r>
+                                <w:rPr>
+                                  <w:rFonts w:ascii="Arial" w:hAnsi="Arial"/>
+                                  <w:sz w:val="19"/>
+                                  <w:color w:val="414141"/>
+                                </w:rPr>
+                                <w:t>Languages: Cantonese (native) | Mandarin (proficient) | English (good reading and writing)</w:t>
+                              </w:r>
+                            </w:p>
                           </w:txbxContent>
                         </wps:txbx>
                         <wps:bodyPr rot="0" vert="horz" wrap="square" lIns="91440" tIns="45720" rIns="91440" bIns="45720" anchor="ctr" anchorCtr="0">
@@ -1578,6 +1598,26 @@
                             <w:szCs w:val="21"/>
                           </w:rPr>
                           <w:t xml:space="preserve">Jul 2007 - Jun 2010          School of Computer Science, SCUT  (Master's)</w:t>
+                        </w:r>
+                      </w:p>
+                      <w:p>
+                        <w:pPr>
+                          <w:adjustRightInd w:val="0"/>
+                          <w:snapToGrid w:val="0"/>
+                          <w:rPr>
+                            <w:rFonts w:ascii="微软雅黑" w:hAnsi="微软雅黑" w:hint="eastAsia"/>
+                            <w:color w:val="414141"/>
+                            <w:szCs w:val="21"/>
+                          </w:rPr>
+                          <w:spacing w:before="70" w:after="0" w:line="240" w:lineRule="auto"/>
+                        </w:pPr>
+                        <w:r>
+                          <w:rPr>
+                            <w:rFonts w:ascii="Arial" w:hAnsi="Arial"/>
+                            <w:sz w:val="19"/>
+                            <w:color w:val="414141"/>
+                          </w:rPr>
+                          <w:t>Languages: Cantonese (native) | Mandarin (proficient) | English (good reading and writing)</w:t>
                         </w:r>
                       </w:p>
                     </w:txbxContent>

</xml_diff>

<commit_message>
Present Ouroborous engineering contributions
</commit_message>
<xml_diff>
--- a/James_Zhang_Resume_English.docx
+++ b/James_Zhang_Resume_English.docx
@@ -2603,7 +2603,7 @@
                                   <w:iCs/>
                                   <w:sz w:val="20"/>
                                 </w:rPr>
-                                <w:t xml:space="preserve">Ouroboros Incubation Project (2025-2026) | UE5 | Lead Programmer</w:t>
+                                <w:t xml:space="preserve">Ouroborous Incubation Project (2025-2026) | UE5 | Lead Programmer</w:t>
                               </w:r>
                               <w:proofErr w:type="gramStart"/>
                               <w:proofErr w:type="gramEnd"/>
@@ -3178,7 +3178,7 @@
                             <w:iCs/>
                             <w:sz w:val="20"/>
                           </w:rPr>
-                          <w:t xml:space="preserve">Ouroboros Incubation Project (2025-2026) | UE5 | Lead Programmer</w:t>
+                          <w:t xml:space="preserve">Ouroborous Incubation Project (2025-2026) | UE5 | Lead Programmer</w:t>
                         </w:r>
                         <w:proofErr w:type="gramStart"/>
                         <w:proofErr w:type="gramEnd"/>

</xml_diff>

<commit_message>
Add device demos and update contact details
</commit_message>
<xml_diff>
--- a/James_Zhang_Resume_English.docx
+++ b/James_Zhang_Resume_English.docx
@@ -127,7 +127,7 @@
                                     <w:sz w:val="20"/>
                                     <w:szCs w:val="20"/>
                                   </w:rPr>
-                                  <w:t xml:space="preserve">Phone: +86 18620256718</w:t>
+                                  <w:t xml:space="preserve">Phone: +852 6063 5718</w:t>
                                 </w:r>
                               </w:p>
                               <w:p>
@@ -148,7 +148,7 @@
                                     <w:sz w:val="20"/>
                                     <w:szCs w:val="20"/>
                                   </w:rPr>
-                                  <w:t xml:space="preserve">Email: software_charlie@163.com</w:t>
+                                  <w:t xml:space="preserve">Email: scutjames85@gmail.com</w:t>
                                 </w:r>
                               </w:p>
                             </w:txbxContent>
@@ -557,7 +557,7 @@
                               <w:sz w:val="20"/>
                               <w:szCs w:val="20"/>
                             </w:rPr>
-                            <w:t xml:space="preserve">Phone: +86 18620256718</w:t>
+                            <w:t xml:space="preserve">Phone: +852 6063 5718</w:t>
                           </w:r>
                         </w:p>
                         <w:p>
@@ -578,7 +578,7 @@
                               <w:sz w:val="20"/>
                               <w:szCs w:val="20"/>
                             </w:rPr>
-                            <w:t xml:space="preserve">Email: software_charlie@163.com</w:t>
+                            <w:t xml:space="preserve">Email: scutjames85@gmail.com</w:t>
                           </w:r>
                         </w:p>
                       </w:txbxContent>
@@ -2753,7 +2753,7 @@
                                   <w:sz w:val="18"/>
                                   <w:szCs w:val="18"/>
                                 </w:rPr>
-                                <w:t xml:space="preserve">Optimized low-end mobile performance through simplified lighting and materials</w:t>
+                                <w:t xml:space="preserve">Delivered full adaptation from high-end PCs to mid-range phones and low-end Snapdragon 660 devices</w:t>
                               </w:r>
                             </w:p>
                             <w:p>
@@ -3328,7 +3328,7 @@
                             <w:sz w:val="18"/>
                             <w:szCs w:val="18"/>
                           </w:rPr>
-                          <w:t xml:space="preserve">Optimized low-end mobile performance through simplified lighting and materials</w:t>
+                          <w:t xml:space="preserve">Delivered full adaptation from high-end PCs to mid-range phones and low-end Snapdragon 660 devices</w:t>
                         </w:r>
                       </w:p>
                       <w:p>

</xml_diff>

<commit_message>
Add granted invention patents to resume
</commit_message>
<xml_diff>
--- a/James_Zhang_Resume_English.docx
+++ b/James_Zhang_Resume_English.docx
@@ -6560,168 +6560,124 @@
                           <w:txbxContent>
                             <w:p>
                               <w:pPr>
-                                <w:adjustRightInd w:val="0"/>
                                 <w:snapToGrid w:val="0"/>
-                                <w:spacing w:beforeLines="50" w:before="156" w:afterLines="50" w:after="156"/>
-                                <w:rPr>
-                                  <w:rFonts w:ascii="微软雅黑" w:hAnsi="微软雅黑" w:hint="eastAsia"/>
+                                <w:spacing w:before="50" w:after="0" w:line="270" w:lineRule="exact"/>
+                              </w:pPr>
+                              <w:r>
+                                <w:rPr>
+                                  <w:rFonts w:ascii="Arial" w:hAnsi="Arial"/>
+                                  <w:sz w:val="20"/>
+                                  <w:szCs w:val="20"/>
+                                  <w:color w:val="414141"/>
                                   <w:b/>
-                                  <w:bCs/>
-                                  <w:i/>
-                                  <w:iCs/>
-                                  <w:color w:val="414141"/>
-                                  <w:szCs w:val="21"/>
-                                </w:rPr>
-                              </w:pPr>
-                              <w:r>
-                                <w:rPr>
-                                  <w:rFonts w:ascii="微软雅黑" w:hAnsi="微软雅黑" w:hint="eastAsia"/>
-                                  <w:color w:val="414141"/>
-                                  <w:szCs w:val="20"/>
-                                  <w:b/>
-                                  <w:bCs/>
-                                  <w:i/>
-                                  <w:iCs/>
-                                  <w:sz w:val="20"/>
-                                </w:rPr>
-                                <w:t xml:space="preserve">Passionate about technical knowledge sharing</w:t>
+                                </w:rPr>
+                                <w:t>Granted Chinese invention patents</w:t>
                               </w:r>
                             </w:p>
                             <w:p>
                               <w:pPr>
-                                <w:pStyle w:val="2"/>
-                                <w:adjustRightInd w:val="0"/>
                                 <w:snapToGrid w:val="0"/>
-                                <w:ind w:firstLineChars="0"/>
-                                <w:rPr>
-                                  <w:rFonts w:ascii="微软雅黑" w:eastAsia="微软雅黑" w:hAnsi="微软雅黑" w:hint="eastAsia"/>
-                                  <w:color w:val="414141"/>
+                                <w:spacing w:before="0" w:after="0" w:line="270" w:lineRule="exact"/>
+                              </w:pPr>
+                              <w:r>
+                                <w:rPr>
+                                  <w:rFonts w:ascii="Arial" w:hAnsi="Arial"/>
                                   <w:sz w:val="20"/>
                                   <w:szCs w:val="20"/>
-                                </w:rPr>
-                              </w:pPr>
-                              <w:r>
-                                <w:rPr>
-                                  <w:rFonts w:ascii="微软雅黑" w:eastAsia="微软雅黑" w:hAnsi="微软雅黑" w:hint="eastAsia"/>
-                                  <w:color w:val="414141"/>
-                                  <w:sz w:val="18"/>
-                                  <w:szCs w:val="18"/>
-                                </w:rPr>
-                                <w:t xml:space="preserve">5 featured articles in </w:t>
-                              </w:r>
-                              <w:r>
-                                <w:rPr>
-                                  <w:rFonts w:ascii="微软雅黑" w:eastAsia="微软雅黑" w:hAnsi="微软雅黑" w:hint="eastAsia"/>
-                                  <w:color w:val="414141"/>
-                                  <w:sz w:val="20"/>
-                                  <w:szCs w:val="20"/>
-                                  <w:b/>
-                                  <w:bCs/>
-                                </w:rPr>
-                                <w:t xml:space="preserve">NetEase KM</w:t>
+                                  <w:color w:val="414141"/>
+                                </w:rPr>
+                                <w:t>Game Recording Processing Method and Apparatus</w:t>
                               </w:r>
                             </w:p>
                             <w:p>
                               <w:pPr>
-                                <w:pStyle w:val="2"/>
-                                <w:adjustRightInd w:val="0"/>
                                 <w:snapToGrid w:val="0"/>
-                                <w:ind w:firstLineChars="0"/>
-                                <w:rPr>
-                                  <w:rFonts w:ascii="微软雅黑" w:eastAsia="微软雅黑" w:hAnsi="微软雅黑" w:hint="eastAsia"/>
-                                  <w:b/>
-                                  <w:bCs/>
-                                  <w:color w:val="414141"/>
+                                <w:spacing w:before="0" w:after="0" w:line="270" w:lineRule="exact"/>
+                              </w:pPr>
+                              <w:r>
+                                <w:rPr>
+                                  <w:rFonts w:ascii="Arial" w:hAnsi="Arial"/>
                                   <w:sz w:val="20"/>
                                   <w:szCs w:val="20"/>
-                                </w:rPr>
-                              </w:pPr>
-                              <w:r>
-                                <w:rPr>
-                                  <w:rFonts w:ascii="微软雅黑" w:eastAsia="微软雅黑" w:hAnsi="微软雅黑" w:hint="eastAsia"/>
-                                  <w:color w:val="414141"/>
-                                  <w:sz w:val="18"/>
-                                  <w:szCs w:val="18"/>
-                                </w:rPr>
-                                <w:t xml:space="preserve">1 </w:t>
-                              </w:r>
-                              <w:r>
-                                <w:rPr>
-                                  <w:rFonts w:ascii="微软雅黑" w:eastAsia="微软雅黑" w:hAnsi="微软雅黑" w:hint="eastAsia"/>
-                                  <w:color w:val="414141"/>
-                                  <w:sz w:val="20"/>
-                                  <w:szCs w:val="20"/>
-                                  <w:b/>
-                                  <w:bCs/>
-                                </w:rPr>
-                                <w:t xml:space="preserve">company technical salon presentation</w:t>
+                                  <w:color w:val="414141"/>
+                                </w:rPr>
+                                <w:t>CN106039710B | Granted 26 Nov 2019 | Co-inventor (first listed)</w:t>
                               </w:r>
                             </w:p>
                             <w:p>
                               <w:pPr>
-                                <w:pStyle w:val="2"/>
-                                <w:adjustRightInd w:val="0"/>
                                 <w:snapToGrid w:val="0"/>
-                                <w:ind w:firstLineChars="0"/>
-                                <w:rPr>
-                                  <w:rFonts w:ascii="微软雅黑" w:eastAsia="微软雅黑" w:hAnsi="微软雅黑" w:hint="eastAsia"/>
-                                  <w:color w:val="414141"/>
+                                <w:spacing w:before="0" w:after="0" w:line="270" w:lineRule="exact"/>
+                              </w:pPr>
+                              <w:r>
+                                <w:rPr>
+                                  <w:rFonts w:ascii="Arial" w:hAnsi="Arial"/>
                                   <w:sz w:val="20"/>
                                   <w:szCs w:val="20"/>
-                                </w:rPr>
-                              </w:pPr>
-                              <w:r>
-                                <w:rPr>
-                                  <w:rFonts w:ascii="微软雅黑" w:eastAsia="微软雅黑" w:hAnsi="微软雅黑" w:hint="eastAsia"/>
-                                  <w:color w:val="414141"/>
-                                  <w:sz w:val="18"/>
-                                  <w:szCs w:val="18"/>
-                                </w:rPr>
-                                <w:t xml:space="preserve">Multiple internal technical talks</w:t>
+                                  <w:color w:val="414141"/>
+                                </w:rPr>
+                                <w:t>Data Synchronization Method, Apparatus, Electronic Device and Storage Medium</w:t>
                               </w:r>
                             </w:p>
                             <w:p>
                               <w:pPr>
-                                <w:pStyle w:val="2"/>
-                                <w:adjustRightInd w:val="0"/>
                                 <w:snapToGrid w:val="0"/>
-                                <w:ind w:firstLineChars="0"/>
-                                <w:rPr>
-                                  <w:rFonts w:ascii="微软雅黑" w:eastAsia="微软雅黑" w:hAnsi="微软雅黑" w:hint="eastAsia"/>
-                                  <w:color w:val="414141"/>
+                                <w:spacing w:before="0" w:after="0" w:line="270" w:lineRule="exact"/>
+                              </w:pPr>
+                              <w:r>
+                                <w:rPr>
+                                  <w:rFonts w:ascii="Arial" w:hAnsi="Arial"/>
                                   <w:sz w:val="20"/>
                                   <w:szCs w:val="20"/>
-                                </w:rPr>
-                                <w:jc w:val="left"/>
+                                  <w:color w:val="414141"/>
+                                </w:rPr>
+                                <w:t>CN116521789B | Granted 18 Jul 2025 | Sole inventor</w:t>
+                              </w:r>
+                            </w:p>
+                            <w:p>
+                              <w:pPr>
+                                <w:snapToGrid w:val="0"/>
+                                <w:spacing w:before="50" w:after="0" w:line="270" w:lineRule="exact"/>
                               </w:pPr>
                               <w:r>
                                 <w:rPr>
-                                  <w:rFonts w:ascii="微软雅黑" w:eastAsia="微软雅黑" w:hAnsi="微软雅黑" w:hint="eastAsia"/>
-                                  <w:color w:val="414141"/>
-                                  <w:sz w:val="18"/>
-                                  <w:szCs w:val="18"/>
-                                </w:rPr>
-                                <w:t xml:space="preserve">As a Fantasy Westward Journey technical expert, resolved cross-project issues and received the </w:t>
-                              </w:r>
-                              <w:r>
-                                <w:rPr>
-                                  <w:rFonts w:ascii="微软雅黑" w:eastAsia="微软雅黑" w:hAnsi="微软雅黑" w:hint="eastAsia"/>
-                                  <w:color w:val="414141"/>
+                                  <w:rFonts w:ascii="Arial" w:hAnsi="Arial"/>
                                   <w:sz w:val="20"/>
                                   <w:szCs w:val="20"/>
+                                  <w:color w:val="414141"/>
                                   <w:b/>
-                                  <w:bCs/>
-                                </w:rPr>
-                                <w:t xml:space="preserve">Fantasy Expert 'Drumstick' Award</w:t>
-                              </w:r>
-                              <w:r>
-                                <w:rPr>
-                                  <w:rFonts w:ascii="微软雅黑" w:eastAsia="微软雅黑" w:hAnsi="微软雅黑" w:hint="eastAsia"/>
-                                  <w:color w:val="414141"/>
-                                  <w:sz w:val="18"/>
-                                  <w:szCs w:val="18"/>
-                                </w:rPr>
-                                <w:t xml:space="preserve"> twice</w:t>
+                                </w:rPr>
+                                <w:t>Knowledge sharing and recognition</w:t>
+                              </w:r>
+                            </w:p>
+                            <w:p>
+                              <w:pPr>
+                                <w:snapToGrid w:val="0"/>
+                                <w:spacing w:before="0" w:after="0" w:line="270" w:lineRule="exact"/>
+                              </w:pPr>
+                              <w:r>
+                                <w:rPr>
+                                  <w:rFonts w:ascii="Arial" w:hAnsi="Arial"/>
+                                  <w:sz w:val="20"/>
+                                  <w:szCs w:val="20"/>
+                                  <w:color w:val="414141"/>
+                                </w:rPr>
+                                <w:t>5 featured NetEase KM articles; 1 company technical salon presentation; multiple internal talks.</w:t>
+                              </w:r>
+                            </w:p>
+                            <w:p>
+                              <w:pPr>
+                                <w:snapToGrid w:val="0"/>
+                                <w:spacing w:before="0" w:after="0" w:line="270" w:lineRule="exact"/>
+                              </w:pPr>
+                              <w:r>
+                                <w:rPr>
+                                  <w:rFonts w:ascii="Arial" w:hAnsi="Arial"/>
+                                  <w:sz w:val="20"/>
+                                  <w:szCs w:val="20"/>
+                                  <w:color w:val="414141"/>
+                                </w:rPr>
+                                <w:t>Twice received the Fantasy Expert 'Drumstick' Award for cross-project technical problem-solving.</w:t>
                               </w:r>
                             </w:p>
                           </w:txbxContent>
@@ -6788,168 +6744,124 @@
                     <w:txbxContent>
                       <w:p>
                         <w:pPr>
-                          <w:adjustRightInd w:val="0"/>
                           <w:snapToGrid w:val="0"/>
-                          <w:spacing w:beforeLines="50" w:before="156" w:afterLines="50" w:after="156"/>
-                          <w:rPr>
-                            <w:rFonts w:ascii="微软雅黑" w:hAnsi="微软雅黑" w:hint="eastAsia"/>
+                          <w:spacing w:before="50" w:after="0" w:line="270" w:lineRule="exact"/>
+                        </w:pPr>
+                        <w:r>
+                          <w:rPr>
+                            <w:rFonts w:ascii="Arial" w:hAnsi="Arial"/>
+                            <w:sz w:val="20"/>
+                            <w:szCs w:val="20"/>
+                            <w:color w:val="414141"/>
                             <w:b/>
-                            <w:bCs/>
-                            <w:i/>
-                            <w:iCs/>
-                            <w:color w:val="414141"/>
-                            <w:szCs w:val="21"/>
-                          </w:rPr>
-                        </w:pPr>
-                        <w:r>
-                          <w:rPr>
-                            <w:rFonts w:ascii="微软雅黑" w:hAnsi="微软雅黑" w:hint="eastAsia"/>
-                            <w:color w:val="414141"/>
-                            <w:szCs w:val="20"/>
-                            <w:b/>
-                            <w:bCs/>
-                            <w:i/>
-                            <w:iCs/>
-                            <w:sz w:val="20"/>
-                          </w:rPr>
-                          <w:t xml:space="preserve">Passionate about technical knowledge sharing</w:t>
+                          </w:rPr>
+                          <w:t>Granted Chinese invention patents</w:t>
                         </w:r>
                       </w:p>
                       <w:p>
                         <w:pPr>
-                          <w:pStyle w:val="2"/>
-                          <w:adjustRightInd w:val="0"/>
                           <w:snapToGrid w:val="0"/>
-                          <w:ind w:firstLineChars="0"/>
-                          <w:rPr>
-                            <w:rFonts w:ascii="微软雅黑" w:eastAsia="微软雅黑" w:hAnsi="微软雅黑" w:hint="eastAsia"/>
-                            <w:color w:val="414141"/>
+                          <w:spacing w:before="0" w:after="0" w:line="270" w:lineRule="exact"/>
+                        </w:pPr>
+                        <w:r>
+                          <w:rPr>
+                            <w:rFonts w:ascii="Arial" w:hAnsi="Arial"/>
                             <w:sz w:val="20"/>
                             <w:szCs w:val="20"/>
-                          </w:rPr>
-                        </w:pPr>
-                        <w:r>
-                          <w:rPr>
-                            <w:rFonts w:ascii="微软雅黑" w:eastAsia="微软雅黑" w:hAnsi="微软雅黑" w:hint="eastAsia"/>
-                            <w:color w:val="414141"/>
-                            <w:sz w:val="18"/>
-                            <w:szCs w:val="18"/>
-                          </w:rPr>
-                          <w:t xml:space="preserve">5 featured articles in </w:t>
-                        </w:r>
-                        <w:r>
-                          <w:rPr>
-                            <w:rFonts w:ascii="微软雅黑" w:eastAsia="微软雅黑" w:hAnsi="微软雅黑" w:hint="eastAsia"/>
-                            <w:color w:val="414141"/>
-                            <w:sz w:val="20"/>
-                            <w:szCs w:val="20"/>
-                            <w:b/>
-                            <w:bCs/>
-                          </w:rPr>
-                          <w:t xml:space="preserve">NetEase KM</w:t>
+                            <w:color w:val="414141"/>
+                          </w:rPr>
+                          <w:t>Game Recording Processing Method and Apparatus</w:t>
                         </w:r>
                       </w:p>
                       <w:p>
                         <w:pPr>
-                          <w:pStyle w:val="2"/>
-                          <w:adjustRightInd w:val="0"/>
                           <w:snapToGrid w:val="0"/>
-                          <w:ind w:firstLineChars="0"/>
-                          <w:rPr>
-                            <w:rFonts w:ascii="微软雅黑" w:eastAsia="微软雅黑" w:hAnsi="微软雅黑" w:hint="eastAsia"/>
-                            <w:b/>
-                            <w:bCs/>
-                            <w:color w:val="414141"/>
+                          <w:spacing w:before="0" w:after="0" w:line="270" w:lineRule="exact"/>
+                        </w:pPr>
+                        <w:r>
+                          <w:rPr>
+                            <w:rFonts w:ascii="Arial" w:hAnsi="Arial"/>
                             <w:sz w:val="20"/>
                             <w:szCs w:val="20"/>
-                          </w:rPr>
-                        </w:pPr>
-                        <w:r>
-                          <w:rPr>
-                            <w:rFonts w:ascii="微软雅黑" w:eastAsia="微软雅黑" w:hAnsi="微软雅黑" w:hint="eastAsia"/>
-                            <w:color w:val="414141"/>
-                            <w:sz w:val="18"/>
-                            <w:szCs w:val="18"/>
-                          </w:rPr>
-                          <w:t xml:space="preserve">1 </w:t>
-                        </w:r>
-                        <w:r>
-                          <w:rPr>
-                            <w:rFonts w:ascii="微软雅黑" w:eastAsia="微软雅黑" w:hAnsi="微软雅黑" w:hint="eastAsia"/>
-                            <w:color w:val="414141"/>
-                            <w:sz w:val="20"/>
-                            <w:szCs w:val="20"/>
-                            <w:b/>
-                            <w:bCs/>
-                          </w:rPr>
-                          <w:t xml:space="preserve">company technical salon presentation</w:t>
+                            <w:color w:val="414141"/>
+                          </w:rPr>
+                          <w:t>CN106039710B | Granted 26 Nov 2019 | Co-inventor (first listed)</w:t>
                         </w:r>
                       </w:p>
                       <w:p>
                         <w:pPr>
-                          <w:pStyle w:val="2"/>
-                          <w:adjustRightInd w:val="0"/>
                           <w:snapToGrid w:val="0"/>
-                          <w:ind w:firstLineChars="0"/>
-                          <w:rPr>
-                            <w:rFonts w:ascii="微软雅黑" w:eastAsia="微软雅黑" w:hAnsi="微软雅黑" w:hint="eastAsia"/>
-                            <w:color w:val="414141"/>
+                          <w:spacing w:before="0" w:after="0" w:line="270" w:lineRule="exact"/>
+                        </w:pPr>
+                        <w:r>
+                          <w:rPr>
+                            <w:rFonts w:ascii="Arial" w:hAnsi="Arial"/>
                             <w:sz w:val="20"/>
                             <w:szCs w:val="20"/>
-                          </w:rPr>
-                        </w:pPr>
-                        <w:r>
-                          <w:rPr>
-                            <w:rFonts w:ascii="微软雅黑" w:eastAsia="微软雅黑" w:hAnsi="微软雅黑" w:hint="eastAsia"/>
-                            <w:color w:val="414141"/>
-                            <w:sz w:val="18"/>
-                            <w:szCs w:val="18"/>
-                          </w:rPr>
-                          <w:t xml:space="preserve">Multiple internal technical talks</w:t>
+                            <w:color w:val="414141"/>
+                          </w:rPr>
+                          <w:t>Data Synchronization Method, Apparatus, Electronic Device and Storage Medium</w:t>
                         </w:r>
                       </w:p>
                       <w:p>
                         <w:pPr>
-                          <w:pStyle w:val="2"/>
-                          <w:adjustRightInd w:val="0"/>
                           <w:snapToGrid w:val="0"/>
-                          <w:ind w:firstLineChars="0"/>
-                          <w:rPr>
-                            <w:rFonts w:ascii="微软雅黑" w:eastAsia="微软雅黑" w:hAnsi="微软雅黑" w:hint="eastAsia"/>
-                            <w:color w:val="414141"/>
+                          <w:spacing w:before="0" w:after="0" w:line="270" w:lineRule="exact"/>
+                        </w:pPr>
+                        <w:r>
+                          <w:rPr>
+                            <w:rFonts w:ascii="Arial" w:hAnsi="Arial"/>
                             <w:sz w:val="20"/>
                             <w:szCs w:val="20"/>
-                          </w:rPr>
-                          <w:jc w:val="left"/>
+                            <w:color w:val="414141"/>
+                          </w:rPr>
+                          <w:t>CN116521789B | Granted 18 Jul 2025 | Sole inventor</w:t>
+                        </w:r>
+                      </w:p>
+                      <w:p>
+                        <w:pPr>
+                          <w:snapToGrid w:val="0"/>
+                          <w:spacing w:before="50" w:after="0" w:line="270" w:lineRule="exact"/>
                         </w:pPr>
                         <w:r>
                           <w:rPr>
-                            <w:rFonts w:ascii="微软雅黑" w:eastAsia="微软雅黑" w:hAnsi="微软雅黑" w:hint="eastAsia"/>
-                            <w:color w:val="414141"/>
-                            <w:sz w:val="18"/>
-                            <w:szCs w:val="18"/>
-                          </w:rPr>
-                          <w:t xml:space="preserve">As a Fantasy Westward Journey technical expert, resolved cross-project issues and received the </w:t>
-                        </w:r>
-                        <w:r>
-                          <w:rPr>
-                            <w:rFonts w:ascii="微软雅黑" w:eastAsia="微软雅黑" w:hAnsi="微软雅黑" w:hint="eastAsia"/>
-                            <w:color w:val="414141"/>
+                            <w:rFonts w:ascii="Arial" w:hAnsi="Arial"/>
                             <w:sz w:val="20"/>
                             <w:szCs w:val="20"/>
+                            <w:color w:val="414141"/>
                             <w:b/>
-                            <w:bCs/>
-                          </w:rPr>
-                          <w:t xml:space="preserve">Fantasy Expert 'Drumstick' Award</w:t>
-                        </w:r>
-                        <w:r>
-                          <w:rPr>
-                            <w:rFonts w:ascii="微软雅黑" w:eastAsia="微软雅黑" w:hAnsi="微软雅黑" w:hint="eastAsia"/>
-                            <w:color w:val="414141"/>
-                            <w:sz w:val="18"/>
-                            <w:szCs w:val="18"/>
-                          </w:rPr>
-                          <w:t xml:space="preserve"> twice</w:t>
+                          </w:rPr>
+                          <w:t>Knowledge sharing and recognition</w:t>
+                        </w:r>
+                      </w:p>
+                      <w:p>
+                        <w:pPr>
+                          <w:snapToGrid w:val="0"/>
+                          <w:spacing w:before="0" w:after="0" w:line="270" w:lineRule="exact"/>
+                        </w:pPr>
+                        <w:r>
+                          <w:rPr>
+                            <w:rFonts w:ascii="Arial" w:hAnsi="Arial"/>
+                            <w:sz w:val="20"/>
+                            <w:szCs w:val="20"/>
+                            <w:color w:val="414141"/>
+                          </w:rPr>
+                          <w:t>5 featured NetEase KM articles; 1 company technical salon presentation; multiple internal talks.</w:t>
+                        </w:r>
+                      </w:p>
+                      <w:p>
+                        <w:pPr>
+                          <w:snapToGrid w:val="0"/>
+                          <w:spacing w:before="0" w:after="0" w:line="270" w:lineRule="exact"/>
+                        </w:pPr>
+                        <w:r>
+                          <w:rPr>
+                            <w:rFonts w:ascii="Arial" w:hAnsi="Arial"/>
+                            <w:sz w:val="20"/>
+                            <w:szCs w:val="20"/>
+                            <w:color w:val="414141"/>
+                          </w:rPr>
+                          <w:t>Twice received the Fantasy Expert 'Drumstick' Award for cross-project technical problem-solving.</w:t>
                         </w:r>
                       </w:p>
                     </w:txbxContent>

</xml_diff>